<commit_message>
Drop junior framing from CV and add education and links
Remove Junior from the CV titles, profile text and document metadata: two
years of lead ownership is what the content already describes.

Add an Education section and route the contact block through the portfolio
site and LinkedIn. The Portfolio field previously pointed at the GitHub
profile, so a recruiter opening the CV landed on an empty page instead of
the portfolio.

Also fix the sidebar source-policy box, whose text overflowed its panel.

Co-Authored-By: Claude Opus 5 <noreply@anthropic.com>
</commit_message>
<xml_diff>
--- a/public/cv/Sergey_Senchenko_CV.docx
+++ b/public/cv/Sergey_Senchenko_CV.docx
@@ -27,7 +27,7 @@
           <w:color w:val="9D1C1C"/>
           <w:sz w:val="23"/>
         </w:rPr>
-        <w:t>Junior Technical Designer | Gameplay Scripter | Level Designer</w:t>
+        <w:t>Technical Designer | Gameplay Scripter | Level Designer</w:t>
       </w:r>
     </w:p>
     <w:p>
@@ -51,9 +51,36 @@
         </w:r>
       </w:hyperlink>
       <w:r>
-        <w:t xml:space="preserve"> | </w:t>
+        <w:br/>
+        <w:t xml:space="preserve">Portfolio: </w:t>
       </w:r>
       <w:hyperlink r:id="rId10">
+        <w:r>
+          <w:rPr>
+            <w:rFonts w:ascii="Calibri" w:hAnsi="Calibri"/>
+            <w:color w:val="6B1D1D"/>
+            <w:sz w:val="19"/>
+          </w:rPr>
+          <w:t>juze1234.github.io</w:t>
+        </w:r>
+      </w:hyperlink>
+      <w:r>
+        <w:t xml:space="preserve"> | LinkedIn: </w:t>
+      </w:r>
+      <w:hyperlink r:id="rId11">
+        <w:r>
+          <w:rPr>
+            <w:rFonts w:ascii="Calibri" w:hAnsi="Calibri"/>
+            <w:color w:val="6B1D1D"/>
+            <w:sz w:val="19"/>
+          </w:rPr>
+          <w:t>linkedin.com/in/sergey-senchenko-951aa837b</w:t>
+        </w:r>
+      </w:hyperlink>
+      <w:r>
+        <w:t xml:space="preserve"> | GitHub: </w:t>
+      </w:r>
+      <w:hyperlink r:id="rId12">
         <w:r>
           <w:rPr>
             <w:rFonts w:ascii="Calibri" w:hAnsi="Calibri"/>
@@ -64,16 +91,16 @@
         </w:r>
       </w:hyperlink>
       <w:r>
-        <w:t xml:space="preserve"> | </w:t>
+        <w:t xml:space="preserve"> | Project videos: </w:t>
       </w:r>
-      <w:hyperlink r:id="rId11">
+      <w:hyperlink r:id="rId13">
         <w:r>
           <w:rPr>
             <w:rFonts w:ascii="Calibri" w:hAnsi="Calibri"/>
             <w:color w:val="6B1D1D"/>
             <w:sz w:val="19"/>
           </w:rPr>
-          <w:t>Project videos</w:t>
+          <w:t>youtube.com/@MetroWARrpOFF</w:t>
         </w:r>
       </w:hyperlink>
     </w:p>
@@ -102,7 +129,7 @@
           <w:color w:val="1C1F20"/>
           <w:sz w:val="18"/>
         </w:rPr>
-        <w:t>Junior technical designer and gameplay scripter with two years of hands-on experience leading development of a multiplayer DayZ project. Experience includes Enforce Script, server-authoritative gameplay systems, data-driven player customization, persistent identity and progression, level design, asset integration, and end-to-end QA. Comfortable owning features from concept through implementation, testing, and player-facing iteration.</w:t>
+        <w:t>Technical designer and gameplay scripter with two years of hands-on experience leading development of a multiplayer DayZ project. Experience includes Enforce Script, server-authoritative gameplay systems, data-driven player customization, persistent identity and progression, level design, asset integration, and end-to-end QA. Comfortable owning features from concept through implementation, testing, and player-facing iteration.</w:t>
       </w:r>
     </w:p>
     <w:p>
@@ -392,6 +419,34 @@
           <w:color w:val="9D1C1C"/>
           <w:sz w:val="23"/>
         </w:rPr>
+        <w:t>EDUCATION</w:t>
+      </w:r>
+    </w:p>
+    <w:p>
+      <w:pPr>
+        <w:spacing w:after="0"/>
+      </w:pPr>
+      <w:r>
+        <w:rPr>
+          <w:rFonts w:ascii="Calibri" w:hAnsi="Calibri" w:eastAsia="Calibri"/>
+          <w:color w:val="1C1F20"/>
+          <w:sz w:val="18"/>
+        </w:rPr>
+        <w:t>Tallinn Polytechnic School (Tallinna Polütehnikum) - IT Specialist</w:t>
+      </w:r>
+    </w:p>
+    <w:p>
+      <w:pPr>
+        <w:pStyle w:val="Heading1"/>
+        <w:keepNext/>
+      </w:pPr>
+      <w:r>
+        <w:rPr>
+          <w:rFonts w:ascii="Calibri" w:hAnsi="Calibri" w:eastAsia="Calibri"/>
+          <w:b/>
+          <w:color w:val="9D1C1C"/>
+          <w:sz w:val="23"/>
+        </w:rPr>
         <w:t>LANGUAGES</w:t>
       </w:r>
     </w:p>
@@ -409,7 +464,7 @@
       </w:r>
     </w:p>
     <w:sectPr>
-      <w:footerReference w:type="default" r:id="rId12"/>
+      <w:footerReference w:type="default" r:id="rId14"/>
       <w:pgSz w:w="12240" w:h="15840"/>
       <w:pgMar w:top="1037" w:right="1181" w:bottom="936" w:left="1181" w:header="504" w:footer="504" w:gutter="0"/>
       <w:cols w:space="720"/>

</xml_diff>